<commit_message>
Case 2 v1.3 final: resolve all placeholders
Per user direction:
- Title: drop initials, keep "мужчина, 58 лет"
- T2DM: 15 years duration, compensated on combination therapy
- Profession: бухгалтер (sedentary work — supports the "малоподвижный
  образ жизни" risk factor and is realistic for a 58yo Russian patient)
- Smoking: removed (не курит)
- Heredity: section dropped entirely
- HF: stage I, FC II (NYHA) — consistent with HFA-PEFF 5 + NT-proBNP
  300 + symptoms-on-moderate-exertion + preserved EF
- Risk factors: age ≥55 (men), T2DM, overweight (BMI 26.5), sedentary
  lifestyle (replaced "курение" which is no longer applicable)
- АГ history: "систематического самоконтроля АД до текущего обращения
  не проводил" — replaces vague placeholder for previous BP values
- Examination: dropped "[рек.]" annotations on physical exam line

Case 2 is now final and ready for Word export.

https://claude.ai/code/session_01Ar9z3rDbBhB3wMjA9xSC63
</commit_message>
<xml_diff>
--- a/tasks/slides/2026-06-05_konkor-am_case-2.docx
+++ b/tasks/slides/2026-06-05_konkor-am_case-2.docx
@@ -98,7 +98,7 @@
         <w:pStyle w:val="BlockText"/>
       </w:pPr>
       <w:r>
-        <w:t xml:space="preserve">Версия 1.1 — после verification pass (V1–V11) и совета (commit 60e2d88, артефакты</w:t>
+        <w:t xml:space="preserve">Версия 1.3 (финальная) — после двух итераций совета (артефакты в репо:</w:t>
       </w:r>
       <w:r>
         <w:t xml:space="preserve"> </w:t>
@@ -122,33 +122,10 @@
         <w:rPr>
           <w:rStyle w:val="VerbatimChar"/>
         </w:rPr>
-        <w:t xml:space="preserve">council-transcript-2026-06-05_063606.md</w:t>
-      </w:r>
-      <w:r>
-        <w:t xml:space="preserve">). Применены решения пользователя по 6 из 7 рекомендаций.</w:t>
-      </w:r>
-    </w:p>
-    <w:p>
-      <w:pPr>
-        <w:pStyle w:val="BlockText"/>
-      </w:pPr>
-      <w:r>
-        <w:t xml:space="preserve">Поля</w:t>
-      </w:r>
-      <w:r>
-        <w:t xml:space="preserve"> </w:t>
-      </w:r>
-      <w:r>
-        <w:rPr>
-          <w:rStyle w:val="VerbatimChar"/>
-        </w:rPr>
-        <w:t xml:space="preserve">[рек.]</w:t>
-      </w:r>
-      <w:r>
-        <w:t xml:space="preserve"> </w:t>
-      </w:r>
-      <w:r>
-        <w:t xml:space="preserve">— placeholder’ы из скелета Claude.ai; подлежат сверке с реальными слайдами 1/2/4 до финализации.</w:t>
+        <w:t xml:space="preserve">council-report-2026-06-05_071008.html</w:t>
+      </w:r>
+      <w:r>
+        <w:t xml:space="preserve">) и применения 8 из 9 рекомендаций. Placeholder’ы раскрыты по решениям пользователя.</w:t>
       </w:r>
     </w:p>
     <w:p>
@@ -176,29 +153,7 @@
           <w:bCs/>
           <w:b/>
         </w:rPr>
-        <w:t xml:space="preserve">Пациент</w:t>
-      </w:r>
-      <w:r>
-        <w:rPr>
-          <w:bCs/>
-          <w:b/>
-        </w:rPr>
-        <w:t xml:space="preserve"> </w:t>
-      </w:r>
-      <w:r>
-        <w:rPr>
-          <w:rStyle w:val="VerbatimChar"/>
-          <w:bCs/>
-          <w:b/>
-        </w:rPr>
-        <w:t xml:space="preserve">[инициалы — рек.]</w:t>
-      </w:r>
-      <w:r>
-        <w:rPr>
-          <w:bCs/>
-          <w:b/>
-        </w:rPr>
-        <w:t xml:space="preserve">, мужчина, 58 лет.</w:t>
+        <w:t xml:space="preserve">Пациент, мужчина, 58 лет.</w:t>
       </w:r>
     </w:p>
     <w:p>
@@ -257,16 +212,23 @@
         <w:t xml:space="preserve"> </w:t>
       </w:r>
       <w:r>
-        <w:t xml:space="preserve">- АГ ~5 лет.</w:t>
-      </w:r>
-      <w:r>
-        <w:t xml:space="preserve"> </w:t>
-      </w:r>
-      <w:r>
-        <w:rPr>
-          <w:rStyle w:val="VerbatimChar"/>
-        </w:rPr>
-        <w:t xml:space="preserve">[рек.: макс./текущее АД до обращения]</w:t>
+        <w:t xml:space="preserve">- АГ ~5 лет; систематического самоконтроля АД до текущего обращения пациент не проводил.</w:t>
+      </w:r>
+      <w:r>
+        <w:t xml:space="preserve"> </w:t>
+      </w:r>
+      <w:r>
+        <w:t xml:space="preserve">- 2023 — Q-позитивный нижний инфаркт миокарда; ЧКВ со стентированием</w:t>
+      </w:r>
+      <w:r>
+        <w:t xml:space="preserve"> </w:t>
+      </w:r>
+      <w:r>
+        <w:rPr>
+          <w:bCs/>
+          <w:b/>
+        </w:rPr>
+        <w:t xml:space="preserve">ПКА</w:t>
       </w:r>
       <w:r>
         <w:t xml:space="preserve">.</w:t>
@@ -275,25 +237,6 @@
         <w:t xml:space="preserve"> </w:t>
       </w:r>
       <w:r>
-        <w:t xml:space="preserve">- 2023 — Q-позитивный нижний инфаркт миокарда; ЧКВ со стентированием</w:t>
-      </w:r>
-      <w:r>
-        <w:t xml:space="preserve"> </w:t>
-      </w:r>
-      <w:r>
-        <w:rPr>
-          <w:bCs/>
-          <w:b/>
-        </w:rPr>
-        <w:t xml:space="preserve">ПКА</w:t>
-      </w:r>
-      <w:r>
-        <w:t xml:space="preserve">.</w:t>
-      </w:r>
-      <w:r>
-        <w:t xml:space="preserve"> </w:t>
-      </w:r>
-      <w:r>
         <w:t xml:space="preserve">-</w:t>
       </w:r>
       <w:r>
@@ -310,19 +253,7 @@
         <w:t xml:space="preserve"> </w:t>
       </w:r>
       <w:r>
-        <w:t xml:space="preserve">- СД2</w:t>
-      </w:r>
-      <w:r>
-        <w:t xml:space="preserve"> </w:t>
-      </w:r>
-      <w:r>
-        <w:rPr>
-          <w:rStyle w:val="VerbatimChar"/>
-        </w:rPr>
-        <w:t xml:space="preserve">[рек.: длительность]</w:t>
-      </w:r>
-      <w:r>
-        <w:t xml:space="preserve">, компенсирован на комбинированной терапии.</w:t>
+        <w:t xml:space="preserve">- Сахарный диабет 2 типа — 15 лет, компенсирован на комбинированной сахароснижающей терапии.</w:t>
       </w:r>
     </w:p>
     <w:p>
@@ -394,43 +325,7 @@
         <w:t xml:space="preserve"> </w:t>
       </w:r>
       <w:r>
-        <w:t xml:space="preserve">профессия</w:t>
-      </w:r>
-      <w:r>
-        <w:t xml:space="preserve"> </w:t>
-      </w:r>
-      <w:r>
-        <w:rPr>
-          <w:rStyle w:val="VerbatimChar"/>
-        </w:rPr>
-        <w:t xml:space="preserve">[рек.]</w:t>
-      </w:r>
-      <w:r>
-        <w:t xml:space="preserve">; курение</w:t>
-      </w:r>
-      <w:r>
-        <w:t xml:space="preserve"> </w:t>
-      </w:r>
-      <w:r>
-        <w:rPr>
-          <w:rStyle w:val="VerbatimChar"/>
-        </w:rPr>
-        <w:t xml:space="preserve">[рек.: ~5 сиг/сут ~10 лет ≈ 2,5 пачка-лет]</w:t>
-      </w:r>
-      <w:r>
-        <w:t xml:space="preserve">; алкоголь умеренно</w:t>
-      </w:r>
-      <w:r>
-        <w:t xml:space="preserve"> </w:t>
-      </w:r>
-      <w:r>
-        <w:rPr>
-          <w:rStyle w:val="VerbatimChar"/>
-        </w:rPr>
-        <w:t xml:space="preserve">[рек.]</w:t>
-      </w:r>
-      <w:r>
-        <w:t xml:space="preserve">.</w:t>
+        <w:t xml:space="preserve">бухгалтер, работа сидячая; не курит; алкоголь умеренно.</w:t>
       </w:r>
     </w:p>
     <w:p>
@@ -448,31 +343,7 @@
         <w:t xml:space="preserve"> </w:t>
       </w:r>
       <w:r>
-        <w:t xml:space="preserve">СД2; избыточная масса тела (ИМТ 26,5); курение.</w:t>
-      </w:r>
-    </w:p>
-    <w:p>
-      <w:pPr>
-        <w:pStyle w:val="BodyText"/>
-      </w:pPr>
-      <w:r>
-        <w:rPr>
-          <w:bCs/>
-          <w:b/>
-        </w:rPr>
-        <w:t xml:space="preserve">НАСЛЕДСТВЕННОСТЬ:</w:t>
-      </w:r>
-      <w:r>
-        <w:t xml:space="preserve"> </w:t>
-      </w:r>
-      <w:r>
-        <w:rPr>
-          <w:rStyle w:val="VerbatimChar"/>
-        </w:rPr>
-        <w:t xml:space="preserve">[рек.]</w:t>
-      </w:r>
-      <w:r>
-        <w:t xml:space="preserve">.</w:t>
+        <w:t xml:space="preserve">возраст ≥55 лет (мужчины); сахарный диабет 2 типа; избыточная масса тела (ИМТ 26,5); малоподвижный образ жизни.</w:t>
       </w:r>
     </w:p>
     <w:p>
@@ -525,31 +396,7 @@
         <w:t xml:space="preserve"> </w:t>
       </w:r>
       <w:r>
-        <w:t xml:space="preserve">- Тоны сердца ясные</w:t>
-      </w:r>
-      <w:r>
-        <w:t xml:space="preserve"> </w:t>
-      </w:r>
-      <w:r>
-        <w:rPr>
-          <w:rStyle w:val="VerbatimChar"/>
-        </w:rPr>
-        <w:t xml:space="preserve">[рек.]</w:t>
-      </w:r>
-      <w:r>
-        <w:t xml:space="preserve">; дыхание везикулярное; отёков нет</w:t>
-      </w:r>
-      <w:r>
-        <w:t xml:space="preserve"> </w:t>
-      </w:r>
-      <w:r>
-        <w:rPr>
-          <w:rStyle w:val="VerbatimChar"/>
-        </w:rPr>
-        <w:t xml:space="preserve">[рек.]</w:t>
-      </w:r>
-      <w:r>
-        <w:t xml:space="preserve">.</w:t>
+        <w:t xml:space="preserve">- Тоны сердца ясные; дыхание везикулярное, хрипов нет; отёков нет.</w:t>
       </w:r>
     </w:p>
     <w:p>
@@ -671,31 +518,7 @@
         <w:t xml:space="preserve"> </w:t>
       </w:r>
       <w:r>
-        <w:t xml:space="preserve">&gt; ХСН с сохранённой ФВ ЛЖ (HFA-PEFF 5 баллов), стадия</w:t>
-      </w:r>
-      <w:r>
-        <w:t xml:space="preserve"> </w:t>
-      </w:r>
-      <w:r>
-        <w:rPr>
-          <w:rStyle w:val="VerbatimChar"/>
-        </w:rPr>
-        <w:t xml:space="preserve">[рек.: I]</w:t>
-      </w:r>
-      <w:r>
-        <w:t xml:space="preserve">, ФК</w:t>
-      </w:r>
-      <w:r>
-        <w:t xml:space="preserve"> </w:t>
-      </w:r>
-      <w:r>
-        <w:rPr>
-          <w:rStyle w:val="VerbatimChar"/>
-        </w:rPr>
-        <w:t xml:space="preserve">[рек.: II]</w:t>
-      </w:r>
-      <w:r>
-        <w:t xml:space="preserve">.</w:t>
+        <w:t xml:space="preserve">&gt; ХСН с сохранённой ФВ ЛЖ (HFA-PEFF 5 баллов), стадия I, ФК II по NYHA.</w:t>
       </w:r>
       <w:r>
         <w:t xml:space="preserve"> </w:t>

</xml_diff>